<commit_message>
Lito 40 dias: revisão Parte 2
Co-Authored-By: Claude Opus 5.5 <noreply@anthropic.com>
Claude-Session: https://claude.ai/code/session_01MJjUEEZrxQDEUifKK2vj9g
</commit_message>
<xml_diff>
--- a/roteiros/lito-sousa-morte/LitoSousa40_Parte2.docx
+++ b/roteiros/lito-sousa-morte/LitoSousa40_Parte2.docx
@@ -103,7 +103,7 @@
         <w:rPr>
           <w:color w:val="000000"/>
         </w:rPr>
-        <w:t>As células nervosas vão sendo destruídas. A pessoa perde os movimentos aos poucos. A fala fica lenta. A memória falha.</w:t>
+        <w:t>As células nervosas vão sendo destruídas. O corpo para de obedecer. A fala fica lenta, e o pensamento começa a falhar.</w:t>
       </w:r>
     </w:p>
     <w:p>
@@ -199,7 +199,7 @@
         <w:rPr>
           <w:color w:val="000000"/>
         </w:rPr>
-        <w:t>A notícia se espalhou em poucas horas. Artistas e milhares de seguidores encheram as redes de mensagens. Muitos tinham conhecido a aviação por causa dele.</w:t>
+        <w:t>A notícia se espalhou rapidamente. Artistas e milhares de seguidores encheram as redes de mensagens. Muitos tinham conhecido a aviação por causa dele.</w:t>
       </w:r>
     </w:p>
     <w:p>
@@ -319,7 +319,7 @@
         <w:rPr>
           <w:color w:val="000000"/>
         </w:rPr>
-        <w:t>Ele poderia atravessar o continente, entrar no estudo e nunca receber uma única dose.</w:t>
+        <w:t>Ele poderia viajar até os Estados Unidos, entrar no estudo e nunca receber uma única dose.</w:t>
       </w:r>
     </w:p>
     <w:p>
@@ -391,7 +391,7 @@
         <w:rPr>
           <w:color w:val="000000"/>
         </w:rPr>
-        <w:t>Foi ali que Lito disse uma frase que os fãs nunca mais esqueceram.</w:t>
+        <w:t>Foi ali que Lito disse uma frase que emocionou os fãs.</w:t>
       </w:r>
     </w:p>
     <w:p>
@@ -431,7 +431,7 @@
         <w:rPr>
           <w:color w:val="000000"/>
         </w:rPr>
-        <w:t>Escreveu para pesquisadores ligados a Harvard e ao Instituto de Tecnologia de Massachusetts, o MIT. Leu tudo o que encontrou sobre substâncias experimentais contra doenças desse tipo.</w:t>
+        <w:t>Escreveu para pesquisadores ligados a Harvard e ao Instituto de Tecnologia de Massachusetts, o MIT. Pesquisou cada substância experimental que estava sendo estudada contra doenças desse tipo.</w:t>
       </w:r>
     </w:p>
     <w:p>
@@ -463,7 +463,7 @@
         <w:rPr>
           <w:color w:val="000000"/>
         </w:rPr>
-        <w:t>Esse é o segundo objeto dessa história. Um frasco que estava do outro lado do continente, num laboratório americano.</w:t>
+        <w:t>Um frasco pequeno, guardado em Nova York. Do outro lado do continente.</w:t>
       </w:r>
     </w:p>
     <w:p>

</xml_diff>